<commit_message>
Build checked presentation, source readers and matching PDF and Word plan
</commit_message>
<xml_diff>
--- a/downloads/Installing-the-Missing-Middle-Plan.docx
+++ b/downloads/Installing-the-Missing-Middle-Plan.docx
@@ -66,7 +66,7 @@
         <w:rPr>
           <w:sz w:val="18"/>
         </w:rPr>
-        <w:t>Concept artwork from the ready SET Co-op Cultural Intelligence Node.</w:t>
+        <w:t>Concept artwork from the Ready SET Co-op Cultural Intelligence Node.</w:t>
       </w:r>
     </w:p>
     <w:p>
@@ -392,7 +392,7 @@
     </w:p>
     <w:p>
       <w:r>
-        <w:t>ready SET Co-op is the repeatable pattern for sustainable employment and training, shared equipment and local ownership. Mutual Futures contributes business succession and knowledge transfer; 500 Queens contributes women-led enterprise, leadership and investment development. People retain ownership of their personal Auras and data. A co-operative owns its agreed assets, not its members’ private lives.</w:t>
+        <w:t>Ready SET Co-op is the repeatable pattern for sustainable employment and training, shared equipment and local ownership. Mutual Futures contributes business succession and knowledge transfer; 500 Queens contributes women-led enterprise, leadership and investment development. People retain ownership of their personal Auras and data. A co-operative owns its agreed assets, not its members’ private lives.</w:t>
       </w:r>
     </w:p>
     <w:p>
@@ -468,7 +468,7 @@
     </w:p>
     <w:p>
       <w:r>
-        <w:t>The outreach algorithm works across all postcodes in parallel through ready SET Co-op, seeking members, business owners, technical people, training partners and organisations interested in shared infrastructure. An expression of interest starts a conversation; people do not need a completed engineering study or an investment commitment to participate in developing the opportunity.</w:t>
+        <w:t>The outreach algorithm works across all postcodes in parallel through Ready SET Co-op, seeking members, business owners, technical people, training partners and organisations interested in shared infrastructure. An expression of interest starts a conversation; people do not need a completed engineering study or an investment commitment to participate in developing the opportunity.</w:t>
       </w:r>
     </w:p>
     <w:p>
@@ -908,7 +908,7 @@
     </w:p>
     <w:p>
       <w:r>
-        <w:t>Media production, local enterprise, technical design, language tools, environmental observation and community-selected applications sit alongside these programmes. Geode Development page 37 explicitly joins ready SET, wellbeing hubs, community twins, media, instrument analysis and materials simulation. Each participating service supplies its workload and resource brief. [D04, p. 37]</w:t>
+        <w:t>Media production, local enterprise, technical design, language tools, environmental observation and community-selected applications sit alongside these programmes. Geode Development page 37 explicitly joins Ready SET, wellbeing hubs, community twins, media, instrument analysis and materials simulation. Each participating service supplies its workload and resource brief. [D04, p. 37]</w:t>
       </w:r>
     </w:p>
     <w:p>
@@ -2173,7 +2173,7 @@
         <w:pStyle w:val="Heading2"/>
       </w:pPr>
       <w:r>
-        <w:t>D13  ready SET Co-op: 2026 Strategy Archive</w:t>
+        <w:t>D13  Ready SET Co-op: 2026 Strategy Archive</w:t>
       </w:r>
     </w:p>
     <w:p>
@@ -2251,7 +2251,7 @@
         <w:pStyle w:val="Heading2"/>
       </w:pPr>
       <w:r>
-        <w:t>P02  ready SET Co-op Cultural Intelligence Node</w:t>
+        <w:t>P02  Ready SET Co-op Cultural Intelligence Node</w:t>
       </w:r>
     </w:p>
     <w:p>
@@ -2274,7 +2274,7 @@
         <w:pStyle w:val="Heading2"/>
       </w:pPr>
       <w:r>
-        <w:t>P03  ready SET Co-op Trust Hub</w:t>
+        <w:t>P03  Ready SET Co-op Trust Hub</w:t>
       </w:r>
     </w:p>
     <w:p>

</xml_diff>